<commit_message>
Prazo de 48 horas do depósito passa a contar da juntada do acordo assinado
Co-Authored-By: Claude Opus 5.5 <noreply@anthropic.com>
Claude-Session: https://claude.ai/code/session_019G44zYPhJLJntoZFXVaaCM
</commit_message>
<xml_diff>
--- a/0801581-45.2026 - Cicero da Silva/Proposta de acordo - Cicero da Silva.docx
+++ b/0801581-45.2026 - Cicero da Silva/Proposta de acordo - Cicero da Silva.docx
@@ -406,7 +406,7 @@
           <w:sz w:val="24"/>
           <w:szCs w:val="24"/>
         </w:rPr>
-        <w:t xml:space="preserve"> contadas da concordância do credor, </w:t>
+        <w:t xml:space="preserve"> contadas da juntada aos autos do acordo assinado pelas partes, </w:t>
       </w:r>
       <w:r>
         <w:rPr>
@@ -967,7 +967,7 @@
           <w:sz w:val="24"/>
           <w:szCs w:val="24"/>
         </w:rPr>
-        <w:t xml:space="preserve">O requerido efetuou depósito judicial no valor de R$ 2.451,48, correspondente à parcela nº 22 da Cédula de Crédito Bancário nº 648892693/30410, conforme guia e comprovante anexos.</w:t>
+        <w:t xml:space="preserve">O requerido efetuará depósito judicial no valor de R$ 2.451,48, correspondente à parcela nº 22 da Cédula de Crédito Bancário nº 648892693/30410, vinculado a estes autos, no prazo de até 48 (quarenta e oito) horas contadas da juntada desta petição e do termo de acordo assinado, comprovando-o nos autos.</w:t>
       </w:r>
     </w:p>
     <w:p>

</xml_diff>